<commit_message>
docs: live deployment at civiclink-five.vercel.app; production verification results; DEF-07/DEF-08
Co-Authored-By: Claude Opus 5.5 <noreply@anthropic.com>
</commit_message>
<xml_diff>
--- a/docs/report/CivicLink_Final_Project_Report.docx
+++ b/docs/report/CivicLink_Final_Project_Report.docx
@@ -25729,28 +25729,18 @@
     <w:p/>
     <w:p>
       <w:r>
-        <w:t>Timings were measured on the development laptop running the emulators, Vite and the browsers at the same time, which is the assessed configuration.</w:t>
+        <w:t>Timings were measured on the development laptop running the emulators, Vite and the browsers at the same time (local configuration).</w:t>
       </w:r>
     </w:p>
     <w:p>
-      <w:pPr>
-        <w:pStyle w:val="Heading2"/>
-        <w:numPr>
-          <w:ilvl w:val="1"/>
-          <w:numId w:val="9"/>
-        </w:numPr>
-      </w:pPr>
-      <w:r>
-        <w:t>Defects and Known Issues</w:t>
-      </w:r>
-    </w:p>
-    <w:p>
-      <w:pPr>
-        <w:pStyle w:val="Caption"/>
-        <w:keepNext/>
-      </w:pPr>
-      <w:r>
-        <w:t>Table 19: Significant defects found and resolved</w:t>
+      <w:r>
+        <w:rPr>
+          <w:b/>
+        </w:rPr>
+        <w:t>Production verification.</w:t>
+      </w:r>
+      <w:r>
+        <w:t xml:space="preserve"> The same Playwright tests were run against the deployed system (https://civiclink-five.vercel.app) on 20 October 2026:</w:t>
       </w:r>
     </w:p>
     <w:tbl>
@@ -25763,10 +25753,8 @@
         <w:tblLayout w:type="fixed"/>
       </w:tblPr>
       <w:tblGrid>
-        <w:gridCol w:w="1058"/>
-        <w:gridCol w:w="1503"/>
-        <w:gridCol w:w="3656"/>
-        <w:gridCol w:w="3144"/>
+        <w:gridCol w:w="5279"/>
+        <w:gridCol w:w="4081"/>
       </w:tblGrid>
       <w:tr>
         <w:trPr>
@@ -25774,7 +25762,7 @@
         </w:trPr>
         <w:tc>
           <w:tcPr>
-            <w:tcW w:type="dxa" w:w="1058"/>
+            <w:tcW w:type="dxa" w:w="5279"/>
             <w:shd w:val="clear" w:color="auto" w:fill="D5EBF4"/>
           </w:tcPr>
           <w:p>
@@ -25786,13 +25774,13 @@
                 <w:b/>
                 <w:sz w:val="18"/>
               </w:rPr>
-              <w:t>ID</w:t>
-            </w:r>
-          </w:p>
-        </w:tc>
-        <w:tc>
-          <w:tcPr>
-            <w:tcW w:type="dxa" w:w="1503"/>
+              <w:t>Test</w:t>
+            </w:r>
+          </w:p>
+        </w:tc>
+        <w:tc>
+          <w:tcPr>
+            <w:tcW w:type="dxa" w:w="4081"/>
             <w:shd w:val="clear" w:color="auto" w:fill="D5EBF4"/>
           </w:tcPr>
           <w:p>
@@ -25804,43 +25792,7 @@
                 <w:b/>
                 <w:sz w:val="18"/>
               </w:rPr>
-              <w:t>Found by</w:t>
-            </w:r>
-          </w:p>
-        </w:tc>
-        <w:tc>
-          <w:tcPr>
-            <w:tcW w:type="dxa" w:w="3656"/>
-            <w:shd w:val="clear" w:color="auto" w:fill="D5EBF4"/>
-          </w:tcPr>
-          <w:p>
-            <w:pPr>
-              <w:spacing w:after="0"/>
-            </w:pPr>
-            <w:r>
-              <w:rPr>
-                <w:b/>
-                <w:sz w:val="18"/>
-              </w:rPr>
-              <w:t>Description</w:t>
-            </w:r>
-          </w:p>
-        </w:tc>
-        <w:tc>
-          <w:tcPr>
-            <w:tcW w:type="dxa" w:w="3144"/>
-            <w:shd w:val="clear" w:color="auto" w:fill="D5EBF4"/>
-          </w:tcPr>
-          <w:p>
-            <w:pPr>
-              <w:spacing w:after="0"/>
-            </w:pPr>
-            <w:r>
-              <w:rPr>
-                <w:b/>
-                <w:sz w:val="18"/>
-              </w:rPr>
-              <w:t>Resolution</w:t>
+              <w:t>Result on the live system</w:t>
             </w:r>
           </w:p>
         </w:tc>
@@ -25848,65 +25800,33 @@
       <w:tr>
         <w:tc>
           <w:tcPr>
-            <w:tcW w:type="dxa" w:w="1058"/>
-          </w:tcPr>
-          <w:p>
-            <w:pPr>
-              <w:spacing w:after="0"/>
-            </w:pPr>
-            <w:r>
-              <w:rPr>
-                <w:sz w:val="18"/>
-              </w:rPr>
-              <w:t>DEF-01</w:t>
-            </w:r>
-          </w:p>
-        </w:tc>
-        <w:tc>
-          <w:tcPr>
-            <w:tcW w:type="dxa" w:w="1503"/>
-          </w:tcPr>
-          <w:p>
-            <w:pPr>
-              <w:spacing w:after="0"/>
-            </w:pPr>
-            <w:r>
-              <w:rPr>
-                <w:sz w:val="18"/>
-              </w:rPr>
-              <w:t>IT-CFG-02</w:t>
-            </w:r>
-          </w:p>
-        </w:tc>
-        <w:tc>
-          <w:tcPr>
-            <w:tcW w:type="dxa" w:w="3656"/>
-          </w:tcPr>
-          <w:p>
-            <w:pPr>
-              <w:spacing w:after="0"/>
-            </w:pPr>
-            <w:r>
-              <w:rPr>
-                <w:sz w:val="18"/>
-              </w:rPr>
-              <w:t>Creating a department whose name produced an existing identifier silently overwrote that department</w:t>
-            </w:r>
-          </w:p>
-        </w:tc>
-        <w:tc>
-          <w:tcPr>
-            <w:tcW w:type="dxa" w:w="3144"/>
-          </w:tcPr>
-          <w:p>
-            <w:pPr>
-              <w:spacing w:after="0"/>
-            </w:pPr>
-            <w:r>
-              <w:rPr>
-                <w:sz w:val="18"/>
-              </w:rPr>
-              <w:t>Creation now refuses existing identifiers; updates require an existing record</w:t>
+            <w:tcW w:type="dxa" w:w="5279"/>
+          </w:tcPr>
+          <w:p>
+            <w:pPr>
+              <w:spacing w:after="0"/>
+            </w:pPr>
+            <w:r>
+              <w:rPr>
+                <w:sz w:val="18"/>
+              </w:rPr>
+              <w:t>E2E-01 full lifecycle (three browser sessions)</w:t>
+            </w:r>
+          </w:p>
+        </w:tc>
+        <w:tc>
+          <w:tcPr>
+            <w:tcW w:type="dxa" w:w="4081"/>
+          </w:tcPr>
+          <w:p>
+            <w:pPr>
+              <w:spacing w:after="0"/>
+            </w:pPr>
+            <w:r>
+              <w:rPr>
+                <w:sz w:val="18"/>
+              </w:rPr>
+              <w:t>Pass. New report on the official's queue after 0.11 s; resolution on the resident's screen after 0.85 s (NFR-05 target 5 s)</w:t>
             </w:r>
           </w:p>
         </w:tc>
@@ -25914,85 +25834,33 @@
       <w:tr>
         <w:tc>
           <w:tcPr>
-            <w:tcW w:type="dxa" w:w="1058"/>
-          </w:tcPr>
-          <w:p>
-            <w:pPr>
-              <w:spacing w:after="0"/>
-            </w:pPr>
-            <w:r>
-              <w:rPr>
-                <w:sz w:val="18"/>
-              </w:rPr>
-              <w:t>DEF-02</w:t>
-            </w:r>
-          </w:p>
-        </w:tc>
-        <w:tc>
-          <w:tcPr>
-            <w:tcW w:type="dxa" w:w="1503"/>
-          </w:tcPr>
-          <w:p>
-            <w:pPr>
-              <w:spacing w:after="0"/>
-            </w:pPr>
-            <w:r>
-              <w:rPr>
-                <w:sz w:val="18"/>
-              </w:rPr>
-              <w:t>E2E-01</w:t>
-            </w:r>
-          </w:p>
-        </w:tc>
-        <w:tc>
-          <w:tcPr>
-            <w:tcW w:type="dxa" w:w="3656"/>
-          </w:tcPr>
-          <w:p>
-            <w:pPr>
-              <w:spacing w:after="0"/>
-            </w:pPr>
-            <w:r>
-              <w:rPr>
-                <w:sz w:val="18"/>
-              </w:rPr>
-              <w:t xml:space="preserve">Submissions with an empty optional field were rejected, because the callable protocol sends </w:t>
-            </w:r>
-            <w:r>
-              <w:rPr>
-                <w:rFonts w:ascii="Consolas" w:hAnsi="Consolas"/>
-                <w:sz w:val="18"/>
-              </w:rPr>
-              <w:t>undefined</w:t>
-            </w:r>
-            <w:r>
-              <w:rPr>
-                <w:sz w:val="18"/>
-              </w:rPr>
-              <w:t xml:space="preserve"> as </w:t>
-            </w:r>
-            <w:r>
-              <w:rPr>
-                <w:rFonts w:ascii="Consolas" w:hAnsi="Consolas"/>
-                <w:sz w:val="18"/>
-              </w:rPr>
-              <w:t>null</w:t>
-            </w:r>
-          </w:p>
-        </w:tc>
-        <w:tc>
-          <w:tcPr>
-            <w:tcW w:type="dxa" w:w="3144"/>
-          </w:tcPr>
-          <w:p>
-            <w:pPr>
-              <w:spacing w:after="0"/>
-            </w:pPr>
-            <w:r>
-              <w:rPr>
-                <w:sz w:val="18"/>
-              </w:rPr>
-              <w:t>The command wrapper treats top-level nulls as absent; regression test IT-RPT-10</w:t>
+            <w:tcW w:type="dxa" w:w="5279"/>
+          </w:tcPr>
+          <w:p>
+            <w:pPr>
+              <w:spacing w:after="0"/>
+            </w:pPr>
+            <w:r>
+              <w:rPr>
+                <w:sz w:val="18"/>
+              </w:rPr>
+              <w:t>E2E-02 duplicate detection, E2E-07 out-of-area GPS</w:t>
+            </w:r>
+          </w:p>
+        </w:tc>
+        <w:tc>
+          <w:tcPr>
+            <w:tcW w:type="dxa" w:w="4081"/>
+          </w:tcPr>
+          <w:p>
+            <w:pPr>
+              <w:spacing w:after="0"/>
+            </w:pPr>
+            <w:r>
+              <w:rPr>
+                <w:sz w:val="18"/>
+              </w:rPr>
+              <w:t>Pass</w:t>
             </w:r>
           </w:p>
         </w:tc>
@@ -26000,65 +25868,33 @@
       <w:tr>
         <w:tc>
           <w:tcPr>
-            <w:tcW w:type="dxa" w:w="1058"/>
-          </w:tcPr>
-          <w:p>
-            <w:pPr>
-              <w:spacing w:after="0"/>
-            </w:pPr>
-            <w:r>
-              <w:rPr>
-                <w:sz w:val="18"/>
-              </w:rPr>
-              <w:t>DEF-03</w:t>
-            </w:r>
-          </w:p>
-        </w:tc>
-        <w:tc>
-          <w:tcPr>
-            <w:tcW w:type="dxa" w:w="1503"/>
-          </w:tcPr>
-          <w:p>
-            <w:pPr>
-              <w:spacing w:after="0"/>
-            </w:pPr>
-            <w:r>
-              <w:rPr>
-                <w:sz w:val="18"/>
-              </w:rPr>
-              <w:t>NFT-08</w:t>
-            </w:r>
-          </w:p>
-        </w:tc>
-        <w:tc>
-          <w:tcPr>
-            <w:tcW w:type="dxa" w:w="3656"/>
-          </w:tcPr>
-          <w:p>
-            <w:pPr>
-              <w:spacing w:after="0"/>
-            </w:pPr>
-            <w:r>
-              <w:rPr>
-                <w:sz w:val="18"/>
-              </w:rPr>
-              <w:t>Three text styles were below the WCAG AA contrast ratio</w:t>
-            </w:r>
-          </w:p>
-        </w:tc>
-        <w:tc>
-          <w:tcPr>
-            <w:tcW w:type="dxa" w:w="3144"/>
-          </w:tcPr>
-          <w:p>
-            <w:pPr>
-              <w:spacing w:after="0"/>
-            </w:pPr>
-            <w:r>
-              <w:rPr>
-                <w:sz w:val="18"/>
-              </w:rPr>
-              <w:t>Darker text colours</w:t>
+            <w:tcW w:type="dxa" w:w="5279"/>
+          </w:tcPr>
+          <w:p>
+            <w:pPr>
+              <w:spacing w:after="0"/>
+            </w:pPr>
+            <w:r>
+              <w:rPr>
+                <w:sz w:val="18"/>
+              </w:rPr>
+              <w:t>E2E-04 access denied per role, E2E-06 wrong password</w:t>
+            </w:r>
+          </w:p>
+        </w:tc>
+        <w:tc>
+          <w:tcPr>
+            <w:tcW w:type="dxa" w:w="4081"/>
+          </w:tcPr>
+          <w:p>
+            <w:pPr>
+              <w:spacing w:after="0"/>
+            </w:pPr>
+            <w:r>
+              <w:rPr>
+                <w:sz w:val="18"/>
+              </w:rPr>
+              <w:t>Pass</w:t>
             </w:r>
           </w:p>
         </w:tc>
@@ -26066,65 +25902,33 @@
       <w:tr>
         <w:tc>
           <w:tcPr>
-            <w:tcW w:type="dxa" w:w="1058"/>
-          </w:tcPr>
-          <w:p>
-            <w:pPr>
-              <w:spacing w:after="0"/>
-            </w:pPr>
-            <w:r>
-              <w:rPr>
-                <w:sz w:val="18"/>
-              </w:rPr>
-              <w:t>DEF-05</w:t>
-            </w:r>
-          </w:p>
-        </w:tc>
-        <w:tc>
-          <w:tcPr>
-            <w:tcW w:type="dxa" w:w="1503"/>
-          </w:tcPr>
-          <w:p>
-            <w:pPr>
-              <w:spacing w:after="0"/>
-            </w:pPr>
-            <w:r>
-              <w:rPr>
-                <w:sz w:val="18"/>
-              </w:rPr>
-              <w:t>E2E-10</w:t>
-            </w:r>
-          </w:p>
-        </w:tc>
-        <w:tc>
-          <w:tcPr>
-            <w:tcW w:type="dxa" w:w="3656"/>
-          </w:tcPr>
-          <w:p>
-            <w:pPr>
-              <w:spacing w:after="0"/>
-            </w:pPr>
-            <w:r>
-              <w:rPr>
-                <w:sz w:val="18"/>
-              </w:rPr>
-              <w:t>The profile form opened with an empty name, because it read the profile before it had loaded</w:t>
-            </w:r>
-          </w:p>
-        </w:tc>
-        <w:tc>
-          <w:tcPr>
-            <w:tcW w:type="dxa" w:w="3144"/>
-          </w:tcPr>
-          <w:p>
-            <w:pPr>
-              <w:spacing w:after="0"/>
-            </w:pPr>
-            <w:r>
-              <w:rPr>
-                <w:sz w:val="18"/>
-              </w:rPr>
-              <w:t>The form is rendered only after the profile loads</w:t>
+            <w:tcW w:type="dxa" w:w="5279"/>
+          </w:tcPr>
+          <w:p>
+            <w:pPr>
+              <w:spacing w:after="0"/>
+            </w:pPr>
+            <w:r>
+              <w:rPr>
+                <w:sz w:val="18"/>
+              </w:rPr>
+              <w:t>NFT-06 page loads</w:t>
+            </w:r>
+          </w:p>
+        </w:tc>
+        <w:tc>
+          <w:tcPr>
+            <w:tcW w:type="dxa" w:w="4081"/>
+          </w:tcPr>
+          <w:p>
+            <w:pPr>
+              <w:spacing w:after="0"/>
+            </w:pPr>
+            <w:r>
+              <w:rPr>
+                <w:sz w:val="18"/>
+              </w:rPr>
+              <w:t>Dashboard 1.02 s, queue 1.06 s, alerts 0.50 s (target 3 s)</w:t>
             </w:r>
           </w:p>
         </w:tc>
@@ -26132,7 +25936,692 @@
       <w:tr>
         <w:tc>
           <w:tcPr>
-            <w:tcW w:type="dxa" w:w="1058"/>
+            <w:tcW w:type="dxa" w:w="5279"/>
+          </w:tcPr>
+          <w:p>
+            <w:pPr>
+              <w:spacing w:after="0"/>
+            </w:pPr>
+            <w:r>
+              <w:rPr>
+                <w:sz w:val="18"/>
+              </w:rPr>
+              <w:t>NFT-08 accessibility (axe-core)</w:t>
+            </w:r>
+          </w:p>
+        </w:tc>
+        <w:tc>
+          <w:tcPr>
+            <w:tcW w:type="dxa" w:w="4081"/>
+          </w:tcPr>
+          <w:p>
+            <w:pPr>
+              <w:spacing w:after="0"/>
+            </w:pPr>
+            <w:r>
+              <w:rPr>
+                <w:sz w:val="18"/>
+              </w:rPr>
+              <w:t>0 violations</w:t>
+            </w:r>
+          </w:p>
+        </w:tc>
+      </w:tr>
+      <w:tr>
+        <w:tc>
+          <w:tcPr>
+            <w:tcW w:type="dxa" w:w="5279"/>
+          </w:tcPr>
+          <w:p>
+            <w:pPr>
+              <w:spacing w:after="0"/>
+            </w:pPr>
+            <w:r>
+              <w:rPr>
+                <w:sz w:val="18"/>
+              </w:rPr>
+              <w:t xml:space="preserve">Hourly maintenance schedule (GitHub Actions → </w:t>
+            </w:r>
+            <w:r>
+              <w:rPr>
+                <w:rFonts w:ascii="Consolas" w:hAnsi="Consolas"/>
+                <w:sz w:val="18"/>
+              </w:rPr>
+              <w:t>/api/cron/maintenance</w:t>
+            </w:r>
+            <w:r>
+              <w:rPr>
+                <w:sz w:val="18"/>
+              </w:rPr>
+              <w:t>)</w:t>
+            </w:r>
+          </w:p>
+        </w:tc>
+        <w:tc>
+          <w:tcPr>
+            <w:tcW w:type="dxa" w:w="4081"/>
+          </w:tcPr>
+          <w:p>
+            <w:pPr>
+              <w:spacing w:after="0"/>
+            </w:pPr>
+            <w:r>
+              <w:rPr>
+                <w:sz w:val="18"/>
+              </w:rPr>
+              <w:t>Run succeeded with the secret; refused without it</w:t>
+            </w:r>
+          </w:p>
+        </w:tc>
+      </w:tr>
+    </w:tbl>
+    <w:p/>
+    <w:p>
+      <w:pPr>
+        <w:pStyle w:val="Heading2"/>
+        <w:numPr>
+          <w:ilvl w:val="1"/>
+          <w:numId w:val="9"/>
+        </w:numPr>
+      </w:pPr>
+      <w:r>
+        <w:t>Defects and Known Issues</w:t>
+      </w:r>
+    </w:p>
+    <w:p>
+      <w:pPr>
+        <w:pStyle w:val="Caption"/>
+        <w:keepNext/>
+      </w:pPr>
+      <w:r>
+        <w:t>Table 19: Significant defects found and resolved</w:t>
+      </w:r>
+    </w:p>
+    <w:tbl>
+      <w:tblPr>
+        <w:tblStyle w:val="TableGrid"/>
+        <w:tblW w:type="auto" w:w="0"/>
+        <w:jc w:val="center"/>
+        <w:tblLayout w:type="fixed"/>
+        <w:tblLook w:firstColumn="1" w:firstRow="1" w:lastColumn="0" w:lastRow="0" w:noHBand="0" w:noVBand="1" w:val="04A0"/>
+        <w:tblLayout w:type="fixed"/>
+      </w:tblPr>
+      <w:tblGrid>
+        <w:gridCol w:w="1024"/>
+        <w:gridCol w:w="1636"/>
+        <w:gridCol w:w="3806"/>
+        <w:gridCol w:w="2894"/>
+      </w:tblGrid>
+      <w:tr>
+        <w:trPr>
+          <w:tblHeader w:val="true"/>
+        </w:trPr>
+        <w:tc>
+          <w:tcPr>
+            <w:tcW w:type="dxa" w:w="1024"/>
+            <w:shd w:val="clear" w:color="auto" w:fill="D5EBF4"/>
+          </w:tcPr>
+          <w:p>
+            <w:pPr>
+              <w:spacing w:after="0"/>
+            </w:pPr>
+            <w:r>
+              <w:rPr>
+                <w:b/>
+                <w:sz w:val="18"/>
+              </w:rPr>
+              <w:t>ID</w:t>
+            </w:r>
+          </w:p>
+        </w:tc>
+        <w:tc>
+          <w:tcPr>
+            <w:tcW w:type="dxa" w:w="1636"/>
+            <w:shd w:val="clear" w:color="auto" w:fill="D5EBF4"/>
+          </w:tcPr>
+          <w:p>
+            <w:pPr>
+              <w:spacing w:after="0"/>
+            </w:pPr>
+            <w:r>
+              <w:rPr>
+                <w:b/>
+                <w:sz w:val="18"/>
+              </w:rPr>
+              <w:t>Found by</w:t>
+            </w:r>
+          </w:p>
+        </w:tc>
+        <w:tc>
+          <w:tcPr>
+            <w:tcW w:type="dxa" w:w="3806"/>
+            <w:shd w:val="clear" w:color="auto" w:fill="D5EBF4"/>
+          </w:tcPr>
+          <w:p>
+            <w:pPr>
+              <w:spacing w:after="0"/>
+            </w:pPr>
+            <w:r>
+              <w:rPr>
+                <w:b/>
+                <w:sz w:val="18"/>
+              </w:rPr>
+              <w:t>Description</w:t>
+            </w:r>
+          </w:p>
+        </w:tc>
+        <w:tc>
+          <w:tcPr>
+            <w:tcW w:type="dxa" w:w="2894"/>
+            <w:shd w:val="clear" w:color="auto" w:fill="D5EBF4"/>
+          </w:tcPr>
+          <w:p>
+            <w:pPr>
+              <w:spacing w:after="0"/>
+            </w:pPr>
+            <w:r>
+              <w:rPr>
+                <w:b/>
+                <w:sz w:val="18"/>
+              </w:rPr>
+              <w:t>Resolution</w:t>
+            </w:r>
+          </w:p>
+        </w:tc>
+      </w:tr>
+      <w:tr>
+        <w:tc>
+          <w:tcPr>
+            <w:tcW w:type="dxa" w:w="1024"/>
+          </w:tcPr>
+          <w:p>
+            <w:pPr>
+              <w:spacing w:after="0"/>
+            </w:pPr>
+            <w:r>
+              <w:rPr>
+                <w:sz w:val="18"/>
+              </w:rPr>
+              <w:t>DEF-01</w:t>
+            </w:r>
+          </w:p>
+        </w:tc>
+        <w:tc>
+          <w:tcPr>
+            <w:tcW w:type="dxa" w:w="1636"/>
+          </w:tcPr>
+          <w:p>
+            <w:pPr>
+              <w:spacing w:after="0"/>
+            </w:pPr>
+            <w:r>
+              <w:rPr>
+                <w:sz w:val="18"/>
+              </w:rPr>
+              <w:t>IT-CFG-02</w:t>
+            </w:r>
+          </w:p>
+        </w:tc>
+        <w:tc>
+          <w:tcPr>
+            <w:tcW w:type="dxa" w:w="3806"/>
+          </w:tcPr>
+          <w:p>
+            <w:pPr>
+              <w:spacing w:after="0"/>
+            </w:pPr>
+            <w:r>
+              <w:rPr>
+                <w:sz w:val="18"/>
+              </w:rPr>
+              <w:t>Creating a department whose name produced an existing identifier silently overwrote that department</w:t>
+            </w:r>
+          </w:p>
+        </w:tc>
+        <w:tc>
+          <w:tcPr>
+            <w:tcW w:type="dxa" w:w="2894"/>
+          </w:tcPr>
+          <w:p>
+            <w:pPr>
+              <w:spacing w:after="0"/>
+            </w:pPr>
+            <w:r>
+              <w:rPr>
+                <w:sz w:val="18"/>
+              </w:rPr>
+              <w:t>Creation now refuses existing identifiers; updates require an existing record</w:t>
+            </w:r>
+          </w:p>
+        </w:tc>
+      </w:tr>
+      <w:tr>
+        <w:tc>
+          <w:tcPr>
+            <w:tcW w:type="dxa" w:w="1024"/>
+          </w:tcPr>
+          <w:p>
+            <w:pPr>
+              <w:spacing w:after="0"/>
+            </w:pPr>
+            <w:r>
+              <w:rPr>
+                <w:sz w:val="18"/>
+              </w:rPr>
+              <w:t>DEF-02</w:t>
+            </w:r>
+          </w:p>
+        </w:tc>
+        <w:tc>
+          <w:tcPr>
+            <w:tcW w:type="dxa" w:w="1636"/>
+          </w:tcPr>
+          <w:p>
+            <w:pPr>
+              <w:spacing w:after="0"/>
+            </w:pPr>
+            <w:r>
+              <w:rPr>
+                <w:sz w:val="18"/>
+              </w:rPr>
+              <w:t>E2E-01</w:t>
+            </w:r>
+          </w:p>
+        </w:tc>
+        <w:tc>
+          <w:tcPr>
+            <w:tcW w:type="dxa" w:w="3806"/>
+          </w:tcPr>
+          <w:p>
+            <w:pPr>
+              <w:spacing w:after="0"/>
+            </w:pPr>
+            <w:r>
+              <w:rPr>
+                <w:sz w:val="18"/>
+              </w:rPr>
+              <w:t xml:space="preserve">Submissions with an empty optional field were rejected, because the callable protocol sends </w:t>
+            </w:r>
+            <w:r>
+              <w:rPr>
+                <w:rFonts w:ascii="Consolas" w:hAnsi="Consolas"/>
+                <w:sz w:val="18"/>
+              </w:rPr>
+              <w:t>undefined</w:t>
+            </w:r>
+            <w:r>
+              <w:rPr>
+                <w:sz w:val="18"/>
+              </w:rPr>
+              <w:t xml:space="preserve"> as </w:t>
+            </w:r>
+            <w:r>
+              <w:rPr>
+                <w:rFonts w:ascii="Consolas" w:hAnsi="Consolas"/>
+                <w:sz w:val="18"/>
+              </w:rPr>
+              <w:t>null</w:t>
+            </w:r>
+          </w:p>
+        </w:tc>
+        <w:tc>
+          <w:tcPr>
+            <w:tcW w:type="dxa" w:w="2894"/>
+          </w:tcPr>
+          <w:p>
+            <w:pPr>
+              <w:spacing w:after="0"/>
+            </w:pPr>
+            <w:r>
+              <w:rPr>
+                <w:sz w:val="18"/>
+              </w:rPr>
+              <w:t>The command wrapper treats top-level nulls as absent; regression test IT-RPT-10</w:t>
+            </w:r>
+          </w:p>
+        </w:tc>
+      </w:tr>
+      <w:tr>
+        <w:tc>
+          <w:tcPr>
+            <w:tcW w:type="dxa" w:w="1024"/>
+          </w:tcPr>
+          <w:p>
+            <w:pPr>
+              <w:spacing w:after="0"/>
+            </w:pPr>
+            <w:r>
+              <w:rPr>
+                <w:sz w:val="18"/>
+              </w:rPr>
+              <w:t>DEF-03</w:t>
+            </w:r>
+          </w:p>
+        </w:tc>
+        <w:tc>
+          <w:tcPr>
+            <w:tcW w:type="dxa" w:w="1636"/>
+          </w:tcPr>
+          <w:p>
+            <w:pPr>
+              <w:spacing w:after="0"/>
+            </w:pPr>
+            <w:r>
+              <w:rPr>
+                <w:sz w:val="18"/>
+              </w:rPr>
+              <w:t>NFT-08</w:t>
+            </w:r>
+          </w:p>
+        </w:tc>
+        <w:tc>
+          <w:tcPr>
+            <w:tcW w:type="dxa" w:w="3806"/>
+          </w:tcPr>
+          <w:p>
+            <w:pPr>
+              <w:spacing w:after="0"/>
+            </w:pPr>
+            <w:r>
+              <w:rPr>
+                <w:sz w:val="18"/>
+              </w:rPr>
+              <w:t>Three text styles were below the WCAG AA contrast ratio</w:t>
+            </w:r>
+          </w:p>
+        </w:tc>
+        <w:tc>
+          <w:tcPr>
+            <w:tcW w:type="dxa" w:w="2894"/>
+          </w:tcPr>
+          <w:p>
+            <w:pPr>
+              <w:spacing w:after="0"/>
+            </w:pPr>
+            <w:r>
+              <w:rPr>
+                <w:sz w:val="18"/>
+              </w:rPr>
+              <w:t>Darker text colours</w:t>
+            </w:r>
+          </w:p>
+        </w:tc>
+      </w:tr>
+      <w:tr>
+        <w:tc>
+          <w:tcPr>
+            <w:tcW w:type="dxa" w:w="1024"/>
+          </w:tcPr>
+          <w:p>
+            <w:pPr>
+              <w:spacing w:after="0"/>
+            </w:pPr>
+            <w:r>
+              <w:rPr>
+                <w:sz w:val="18"/>
+              </w:rPr>
+              <w:t>DEF-05</w:t>
+            </w:r>
+          </w:p>
+        </w:tc>
+        <w:tc>
+          <w:tcPr>
+            <w:tcW w:type="dxa" w:w="1636"/>
+          </w:tcPr>
+          <w:p>
+            <w:pPr>
+              <w:spacing w:after="0"/>
+            </w:pPr>
+            <w:r>
+              <w:rPr>
+                <w:sz w:val="18"/>
+              </w:rPr>
+              <w:t>E2E-10</w:t>
+            </w:r>
+          </w:p>
+        </w:tc>
+        <w:tc>
+          <w:tcPr>
+            <w:tcW w:type="dxa" w:w="3806"/>
+          </w:tcPr>
+          <w:p>
+            <w:pPr>
+              <w:spacing w:after="0"/>
+            </w:pPr>
+            <w:r>
+              <w:rPr>
+                <w:sz w:val="18"/>
+              </w:rPr>
+              <w:t>The profile form opened with an empty name, because it read the profile before it had loaded</w:t>
+            </w:r>
+          </w:p>
+        </w:tc>
+        <w:tc>
+          <w:tcPr>
+            <w:tcW w:type="dxa" w:w="2894"/>
+          </w:tcPr>
+          <w:p>
+            <w:pPr>
+              <w:spacing w:after="0"/>
+            </w:pPr>
+            <w:r>
+              <w:rPr>
+                <w:sz w:val="18"/>
+              </w:rPr>
+              <w:t>The form is rendered only after the profile loads</w:t>
+            </w:r>
+          </w:p>
+        </w:tc>
+      </w:tr>
+      <w:tr>
+        <w:tc>
+          <w:tcPr>
+            <w:tcW w:type="dxa" w:w="1024"/>
+          </w:tcPr>
+          <w:p>
+            <w:pPr>
+              <w:spacing w:after="0"/>
+            </w:pPr>
+            <w:r>
+              <w:rPr>
+                <w:sz w:val="18"/>
+              </w:rPr>
+              <w:t>DEF-06</w:t>
+            </w:r>
+          </w:p>
+        </w:tc>
+        <w:tc>
+          <w:tcPr>
+            <w:tcW w:type="dxa" w:w="1636"/>
+          </w:tcPr>
+          <w:p>
+            <w:pPr>
+              <w:spacing w:after="0"/>
+            </w:pPr>
+            <w:r>
+              <w:rPr>
+                <w:sz w:val="18"/>
+              </w:rPr>
+              <w:t>IT-RPT-08 in CI</w:t>
+            </w:r>
+          </w:p>
+        </w:tc>
+        <w:tc>
+          <w:tcPr>
+            <w:tcW w:type="dxa" w:w="3806"/>
+          </w:tcPr>
+          <w:p>
+            <w:pPr>
+              <w:spacing w:after="0"/>
+            </w:pPr>
+            <w:r>
+              <w:rPr>
+                <w:sz w:val="18"/>
+              </w:rPr>
+              <w:t>Under concurrency, extra reads inside the submission transaction (rate-limit count, profile, settings, officials) caused lock timeouts</w:t>
+            </w:r>
+          </w:p>
+        </w:tc>
+        <w:tc>
+          <w:tcPr>
+            <w:tcW w:type="dxa" w:w="2894"/>
+          </w:tcPr>
+          <w:p>
+            <w:pPr>
+              <w:spacing w:after="0"/>
+            </w:pPr>
+            <w:r>
+              <w:rPr>
+                <w:sz w:val="18"/>
+              </w:rPr>
+              <w:t>Those reads moved before the transaction; it now contends only on the reference counter</w:t>
+            </w:r>
+          </w:p>
+        </w:tc>
+      </w:tr>
+      <w:tr>
+        <w:tc>
+          <w:tcPr>
+            <w:tcW w:type="dxa" w:w="1024"/>
+          </w:tcPr>
+          <w:p>
+            <w:pPr>
+              <w:spacing w:after="0"/>
+            </w:pPr>
+            <w:r>
+              <w:rPr>
+                <w:sz w:val="18"/>
+              </w:rPr>
+              <w:t>DEF-07</w:t>
+            </w:r>
+          </w:p>
+        </w:tc>
+        <w:tc>
+          <w:tcPr>
+            <w:tcW w:type="dxa" w:w="1636"/>
+          </w:tcPr>
+          <w:p>
+            <w:pPr>
+              <w:spacing w:after="0"/>
+            </w:pPr>
+            <w:r>
+              <w:rPr>
+                <w:sz w:val="18"/>
+              </w:rPr>
+              <w:t>E2E-01 run against production</w:t>
+            </w:r>
+          </w:p>
+        </w:tc>
+        <w:tc>
+          <w:tcPr>
+            <w:tcW w:type="dxa" w:w="3806"/>
+          </w:tcPr>
+          <w:p>
+            <w:pPr>
+              <w:spacing w:after="0"/>
+            </w:pPr>
+            <w:r>
+              <w:rPr>
+                <w:sz w:val="18"/>
+              </w:rPr>
+              <w:t>Submission failed in production because the rate-limit query needed a composite index, which the emulator never requires</w:t>
+            </w:r>
+          </w:p>
+        </w:tc>
+        <w:tc>
+          <w:tcPr>
+            <w:tcW w:type="dxa" w:w="2894"/>
+          </w:tcPr>
+          <w:p>
+            <w:pPr>
+              <w:spacing w:after="0"/>
+            </w:pPr>
+            <w:r>
+              <w:rPr>
+                <w:sz w:val="18"/>
+              </w:rPr>
+              <w:t>Index added and deployed; the E2E suite can now run against the deployed URL</w:t>
+            </w:r>
+          </w:p>
+        </w:tc>
+      </w:tr>
+      <w:tr>
+        <w:tc>
+          <w:tcPr>
+            <w:tcW w:type="dxa" w:w="1024"/>
+          </w:tcPr>
+          <w:p>
+            <w:pPr>
+              <w:spacing w:after="0"/>
+            </w:pPr>
+            <w:r>
+              <w:rPr>
+                <w:sz w:val="18"/>
+              </w:rPr>
+              <w:t>DEF-08</w:t>
+            </w:r>
+          </w:p>
+        </w:tc>
+        <w:tc>
+          <w:tcPr>
+            <w:tcW w:type="dxa" w:w="1636"/>
+          </w:tcPr>
+          <w:p>
+            <w:pPr>
+              <w:spacing w:after="0"/>
+            </w:pPr>
+            <w:r>
+              <w:rPr>
+                <w:sz w:val="18"/>
+              </w:rPr>
+              <w:t>First Vercel deployment</w:t>
+            </w:r>
+          </w:p>
+        </w:tc>
+        <w:tc>
+          <w:tcPr>
+            <w:tcW w:type="dxa" w:w="3806"/>
+          </w:tcPr>
+          <w:p>
+            <w:pPr>
+              <w:spacing w:after="0"/>
+            </w:pPr>
+            <w:r>
+              <w:rPr>
+                <w:sz w:val="18"/>
+              </w:rPr>
+              <w:t xml:space="preserve">API calls crashed because a firebase-admin dependency pulls in an ESM-only package that Vercel's loader cannot </w:t>
+            </w:r>
+            <w:r>
+              <w:rPr>
+                <w:rFonts w:ascii="Consolas" w:hAnsi="Consolas"/>
+                <w:sz w:val="18"/>
+              </w:rPr>
+              <w:t>require()</w:t>
+            </w:r>
+          </w:p>
+        </w:tc>
+        <w:tc>
+          <w:tcPr>
+            <w:tcW w:type="dxa" w:w="2894"/>
+          </w:tcPr>
+          <w:p>
+            <w:pPr>
+              <w:spacing w:after="0"/>
+            </w:pPr>
+            <w:r>
+              <w:rPr>
+                <w:sz w:val="18"/>
+              </w:rPr>
+              <w:t>Dependency pinned to a compatible version (npm override)</w:t>
+            </w:r>
+          </w:p>
+        </w:tc>
+      </w:tr>
+      <w:tr>
+        <w:tc>
+          <w:tcPr>
+            <w:tcW w:type="dxa" w:w="1024"/>
           </w:tcPr>
           <w:p>
             <w:pPr>
@@ -26148,7 +26637,7 @@
         </w:tc>
         <w:tc>
           <w:tcPr>
-            <w:tcW w:type="dxa" w:w="1503"/>
+            <w:tcW w:type="dxa" w:w="1636"/>
           </w:tcPr>
           <w:p>
             <w:pPr>
@@ -26164,7 +26653,7 @@
         </w:tc>
         <w:tc>
           <w:tcPr>
-            <w:tcW w:type="dxa" w:w="3656"/>
+            <w:tcW w:type="dxa" w:w="3806"/>
           </w:tcPr>
           <w:p>
             <w:pPr>
@@ -26193,7 +26682,7 @@
         </w:tc>
         <w:tc>
           <w:tcPr>
-            <w:tcW w:type="dxa" w:w="3144"/>
+            <w:tcW w:type="dxa" w:w="2894"/>
           </w:tcPr>
           <w:p>
             <w:pPr>
@@ -26312,7 +26801,7 @@
         <w:t>Demo accounts.</w:t>
       </w:r>
       <w:r>
-        <w:t xml:space="preserve"> All accounts use the password </w:t>
+        <w:t xml:space="preserve"> Locally, all accounts use the password </w:t>
       </w:r>
       <w:r>
         <w:rPr>
@@ -26322,7 +26811,16 @@
         <w:t>CivicLink#2026</w:t>
       </w:r>
       <w:r>
-        <w:t>. The login page offers one-click shortcuts for the main four.</w:t>
+        <w:t xml:space="preserve">, and the login page offers one-click shortcuts for the main four. The deployed system at </w:t>
+      </w:r>
+      <w:r>
+        <w:rPr>
+          <w:b/>
+        </w:rPr>
+        <w:t>https://civiclink-five.vercel.app</w:t>
+      </w:r>
+      <w:r>
+        <w:t xml:space="preserve"> has the same accounts with a private password, supplied to the lecturer separately.</w:t>
       </w:r>
     </w:p>
     <w:p>
@@ -27604,7 +28102,7 @@
         <w:rPr>
           <w:b/>
         </w:rPr>
-        <w:t>bb32d75a137417a9fb6437cad15cd95094fdedcf</w:t>
+        <w:t>6416c93f2b2ab12a12994a70c4bb0e28c8dee35c</w:t>
       </w:r>
       <w:r>
         <w:t>.</w:t>
@@ -27630,19 +28128,10 @@
         <w:rPr>
           <w:b/>
         </w:rPr>
-        <w:t>(deployed URL pending)</w:t>
+        <w:t>https://civiclink-five.vercel.app</w:t>
       </w:r>
       <w:r>
         <w:t xml:space="preserve"> (Vercel + Firebase Spark, decision D3). Demo accounts are listed in Section 8. The local emulator configuration in Section 8 reproduces the same system offline.</w:t>
-      </w:r>
-    </w:p>
-    <w:p>
-      <w:r>
-        <w:rPr>
-          <w:b/>
-          <w:highlight w:val="yellow"/>
-        </w:rPr>
-        <w:t>TO VERIFY BEFORE SUBMISSION: Confirm the deployed URL works and the demo accounts exist in the deployed project before submission.</w:t>
       </w:r>
     </w:p>
     <w:p>
@@ -27672,7 +28161,7 @@
         <w:t>Complete automated test results:</w:t>
       </w:r>
       <w:r>
-        <w:t xml:space="preserve"> the GitHub Actions run for commit bb32d75a137417a9fb6437cad15cd95094fdedcf (tab "Actions"). It includes the Playwright HTML report and the coverage report as downloadable artefacts.</w:t>
+        <w:t xml:space="preserve"> the GitHub Actions run for commit 6416c93f2b2ab12a12994a70c4bb0e28c8dee35c (tab "Actions"). It includes the Playwright HTML report and the coverage report as downloadable artefacts.</w:t>
       </w:r>
     </w:p>
     <w:p>

</xml_diff>

<commit_message>
perf(web): lazy-load staff and field-worker routes (main bundle 1,050 KB -> 395 KB); evidence for Me too and offline mode
Co-Authored-By: Claude Opus 5.5 <noreply@anthropic.com>
</commit_message>
<xml_diff>
--- a/docs/report/CivicLink_Final_Project_Report.docx
+++ b/docs/report/CivicLink_Final_Project_Report.docx
@@ -623,12 +623,22 @@
     </w:p>
     <w:p>
       <w:r>
-        <w:t xml:space="preserve">Figure 27: Firestore document model</w:t>
+        <w:t xml:space="preserve">Figure 27: Resident, "Me too" from the community map</w:t>
       </w:r>
     </w:p>
     <w:p>
       <w:r>
-        <w:t xml:space="preserve">Figure 28: Deployment diagram</w:t>
+        <w:t xml:space="preserve">Figure 28: Resident, offline mode</w:t>
+      </w:r>
+    </w:p>
+    <w:p>
+      <w:r>
+        <w:t xml:space="preserve">Figure 29: Firestore document model</w:t>
+      </w:r>
+    </w:p>
+    <w:p>
+      <w:r>
+        <w:t xml:space="preserve">Figure 30: Deployment diagram</w:t>
       </w:r>
       <w:r>
         <w:fldChar w:fldCharType="end"/>
@@ -10380,10 +10390,10 @@
         <w:tblLayout w:type="fixed"/>
       </w:tblPr>
       <w:tblGrid>
-        <w:gridCol w:w="1030"/>
-        <w:gridCol w:w="2128"/>
-        <w:gridCol w:w="4201"/>
-        <w:gridCol w:w="2001"/>
+        <w:gridCol w:w="1028"/>
+        <w:gridCol w:w="2124"/>
+        <w:gridCol w:w="4219"/>
+        <w:gridCol w:w="1990"/>
       </w:tblGrid>
       <w:tr>
         <w:trPr>
@@ -10391,7 +10401,7 @@
         </w:trPr>
         <w:tc>
           <w:tcPr>
-            <w:tcW w:type="dxa" w:w="1030"/>
+            <w:tcW w:type="dxa" w:w="1028"/>
             <w:shd w:val="clear" w:color="auto" w:fill="D5EBF4"/>
           </w:tcPr>
           <w:p>
@@ -10409,7 +10419,7 @@
         </w:tc>
         <w:tc>
           <w:tcPr>
-            <w:tcW w:type="dxa" w:w="2128"/>
+            <w:tcW w:type="dxa" w:w="2124"/>
             <w:shd w:val="clear" w:color="auto" w:fill="D5EBF4"/>
           </w:tcPr>
           <w:p>
@@ -10427,7 +10437,7 @@
         </w:tc>
         <w:tc>
           <w:tcPr>
-            <w:tcW w:type="dxa" w:w="4201"/>
+            <w:tcW w:type="dxa" w:w="4219"/>
             <w:shd w:val="clear" w:color="auto" w:fill="D5EBF4"/>
           </w:tcPr>
           <w:p>
@@ -10445,7 +10455,7 @@
         </w:tc>
         <w:tc>
           <w:tcPr>
-            <w:tcW w:type="dxa" w:w="2001"/>
+            <w:tcW w:type="dxa" w:w="1990"/>
             <w:shd w:val="clear" w:color="auto" w:fill="D5EBF4"/>
           </w:tcPr>
           <w:p>
@@ -10465,7 +10475,7 @@
       <w:tr>
         <w:tc>
           <w:tcPr>
-            <w:tcW w:type="dxa" w:w="1030"/>
+            <w:tcW w:type="dxa" w:w="1028"/>
           </w:tcPr>
           <w:p>
             <w:pPr>
@@ -10481,7 +10491,7 @@
         </w:tc>
         <w:tc>
           <w:tcPr>
-            <w:tcW w:type="dxa" w:w="2128"/>
+            <w:tcW w:type="dxa" w:w="2124"/>
           </w:tcPr>
           <w:p>
             <w:pPr>
@@ -10497,7 +10507,7 @@
         </w:tc>
         <w:tc>
           <w:tcPr>
-            <w:tcW w:type="dxa" w:w="4201"/>
+            <w:tcW w:type="dxa" w:w="4219"/>
           </w:tcPr>
           <w:p>
             <w:pPr>
@@ -10513,7 +10523,7 @@
         </w:tc>
         <w:tc>
           <w:tcPr>
-            <w:tcW w:type="dxa" w:w="2001"/>
+            <w:tcW w:type="dxa" w:w="1990"/>
           </w:tcPr>
           <w:p>
             <w:pPr>
@@ -10531,7 +10541,7 @@
       <w:tr>
         <w:tc>
           <w:tcPr>
-            <w:tcW w:type="dxa" w:w="1030"/>
+            <w:tcW w:type="dxa" w:w="1028"/>
           </w:tcPr>
           <w:p>
             <w:pPr>
@@ -10547,7 +10557,7 @@
         </w:tc>
         <w:tc>
           <w:tcPr>
-            <w:tcW w:type="dxa" w:w="2128"/>
+            <w:tcW w:type="dxa" w:w="2124"/>
           </w:tcPr>
           <w:p>
             <w:pPr>
@@ -10563,7 +10573,7 @@
         </w:tc>
         <w:tc>
           <w:tcPr>
-            <w:tcW w:type="dxa" w:w="4201"/>
+            <w:tcW w:type="dxa" w:w="4219"/>
           </w:tcPr>
           <w:p>
             <w:pPr>
@@ -10579,7 +10589,7 @@
         </w:tc>
         <w:tc>
           <w:tcPr>
-            <w:tcW w:type="dxa" w:w="2001"/>
+            <w:tcW w:type="dxa" w:w="1990"/>
           </w:tcPr>
           <w:p>
             <w:pPr>
@@ -10597,7 +10607,7 @@
       <w:tr>
         <w:tc>
           <w:tcPr>
-            <w:tcW w:type="dxa" w:w="1030"/>
+            <w:tcW w:type="dxa" w:w="1028"/>
           </w:tcPr>
           <w:p>
             <w:pPr>
@@ -10613,7 +10623,7 @@
         </w:tc>
         <w:tc>
           <w:tcPr>
-            <w:tcW w:type="dxa" w:w="2128"/>
+            <w:tcW w:type="dxa" w:w="2124"/>
           </w:tcPr>
           <w:p>
             <w:pPr>
@@ -10629,7 +10639,7 @@
         </w:tc>
         <w:tc>
           <w:tcPr>
-            <w:tcW w:type="dxa" w:w="4201"/>
+            <w:tcW w:type="dxa" w:w="4219"/>
           </w:tcPr>
           <w:p>
             <w:pPr>
@@ -10645,7 +10655,7 @@
         </w:tc>
         <w:tc>
           <w:tcPr>
-            <w:tcW w:type="dxa" w:w="2001"/>
+            <w:tcW w:type="dxa" w:w="1990"/>
           </w:tcPr>
           <w:p>
             <w:pPr>
@@ -10663,7 +10673,7 @@
       <w:tr>
         <w:tc>
           <w:tcPr>
-            <w:tcW w:type="dxa" w:w="1030"/>
+            <w:tcW w:type="dxa" w:w="1028"/>
           </w:tcPr>
           <w:p>
             <w:pPr>
@@ -10679,7 +10689,7 @@
         </w:tc>
         <w:tc>
           <w:tcPr>
-            <w:tcW w:type="dxa" w:w="2128"/>
+            <w:tcW w:type="dxa" w:w="2124"/>
           </w:tcPr>
           <w:p>
             <w:pPr>
@@ -10695,7 +10705,7 @@
         </w:tc>
         <w:tc>
           <w:tcPr>
-            <w:tcW w:type="dxa" w:w="4201"/>
+            <w:tcW w:type="dxa" w:w="4219"/>
           </w:tcPr>
           <w:p>
             <w:pPr>
@@ -10711,7 +10721,7 @@
         </w:tc>
         <w:tc>
           <w:tcPr>
-            <w:tcW w:type="dxa" w:w="2001"/>
+            <w:tcW w:type="dxa" w:w="1990"/>
           </w:tcPr>
           <w:p>
             <w:pPr>
@@ -10729,7 +10739,7 @@
       <w:tr>
         <w:tc>
           <w:tcPr>
-            <w:tcW w:type="dxa" w:w="1030"/>
+            <w:tcW w:type="dxa" w:w="1028"/>
           </w:tcPr>
           <w:p>
             <w:pPr>
@@ -10745,7 +10755,7 @@
         </w:tc>
         <w:tc>
           <w:tcPr>
-            <w:tcW w:type="dxa" w:w="2128"/>
+            <w:tcW w:type="dxa" w:w="2124"/>
           </w:tcPr>
           <w:p>
             <w:pPr>
@@ -10761,7 +10771,7 @@
         </w:tc>
         <w:tc>
           <w:tcPr>
-            <w:tcW w:type="dxa" w:w="4201"/>
+            <w:tcW w:type="dxa" w:w="4219"/>
           </w:tcPr>
           <w:p>
             <w:pPr>
@@ -10777,7 +10787,7 @@
         </w:tc>
         <w:tc>
           <w:tcPr>
-            <w:tcW w:type="dxa" w:w="2001"/>
+            <w:tcW w:type="dxa" w:w="1990"/>
           </w:tcPr>
           <w:p>
             <w:pPr>
@@ -10795,7 +10805,7 @@
       <w:tr>
         <w:tc>
           <w:tcPr>
-            <w:tcW w:type="dxa" w:w="1030"/>
+            <w:tcW w:type="dxa" w:w="1028"/>
           </w:tcPr>
           <w:p>
             <w:pPr>
@@ -10811,7 +10821,7 @@
         </w:tc>
         <w:tc>
           <w:tcPr>
-            <w:tcW w:type="dxa" w:w="2128"/>
+            <w:tcW w:type="dxa" w:w="2124"/>
           </w:tcPr>
           <w:p>
             <w:pPr>
@@ -10827,7 +10837,7 @@
         </w:tc>
         <w:tc>
           <w:tcPr>
-            <w:tcW w:type="dxa" w:w="4201"/>
+            <w:tcW w:type="dxa" w:w="4219"/>
           </w:tcPr>
           <w:p>
             <w:pPr>
@@ -10843,7 +10853,7 @@
         </w:tc>
         <w:tc>
           <w:tcPr>
-            <w:tcW w:type="dxa" w:w="2001"/>
+            <w:tcW w:type="dxa" w:w="1990"/>
           </w:tcPr>
           <w:p>
             <w:pPr>
@@ -10861,7 +10871,7 @@
       <w:tr>
         <w:tc>
           <w:tcPr>
-            <w:tcW w:type="dxa" w:w="1030"/>
+            <w:tcW w:type="dxa" w:w="1028"/>
           </w:tcPr>
           <w:p>
             <w:pPr>
@@ -10877,7 +10887,7 @@
         </w:tc>
         <w:tc>
           <w:tcPr>
-            <w:tcW w:type="dxa" w:w="2128"/>
+            <w:tcW w:type="dxa" w:w="2124"/>
           </w:tcPr>
           <w:p>
             <w:pPr>
@@ -10893,7 +10903,7 @@
         </w:tc>
         <w:tc>
           <w:tcPr>
-            <w:tcW w:type="dxa" w:w="4201"/>
+            <w:tcW w:type="dxa" w:w="4219"/>
           </w:tcPr>
           <w:p>
             <w:pPr>
@@ -10909,7 +10919,7 @@
         </w:tc>
         <w:tc>
           <w:tcPr>
-            <w:tcW w:type="dxa" w:w="2001"/>
+            <w:tcW w:type="dxa" w:w="1990"/>
           </w:tcPr>
           <w:p>
             <w:pPr>
@@ -10927,7 +10937,7 @@
       <w:tr>
         <w:tc>
           <w:tcPr>
-            <w:tcW w:type="dxa" w:w="1030"/>
+            <w:tcW w:type="dxa" w:w="1028"/>
           </w:tcPr>
           <w:p>
             <w:pPr>
@@ -10943,7 +10953,7 @@
         </w:tc>
         <w:tc>
           <w:tcPr>
-            <w:tcW w:type="dxa" w:w="2128"/>
+            <w:tcW w:type="dxa" w:w="2124"/>
           </w:tcPr>
           <w:p>
             <w:pPr>
@@ -10959,7 +10969,7 @@
         </w:tc>
         <w:tc>
           <w:tcPr>
-            <w:tcW w:type="dxa" w:w="4201"/>
+            <w:tcW w:type="dxa" w:w="4219"/>
           </w:tcPr>
           <w:p>
             <w:pPr>
@@ -10975,7 +10985,7 @@
         </w:tc>
         <w:tc>
           <w:tcPr>
-            <w:tcW w:type="dxa" w:w="2001"/>
+            <w:tcW w:type="dxa" w:w="1990"/>
           </w:tcPr>
           <w:p>
             <w:pPr>
@@ -10993,7 +11003,7 @@
       <w:tr>
         <w:tc>
           <w:tcPr>
-            <w:tcW w:type="dxa" w:w="1030"/>
+            <w:tcW w:type="dxa" w:w="1028"/>
           </w:tcPr>
           <w:p>
             <w:pPr>
@@ -11009,7 +11019,7 @@
         </w:tc>
         <w:tc>
           <w:tcPr>
-            <w:tcW w:type="dxa" w:w="2128"/>
+            <w:tcW w:type="dxa" w:w="2124"/>
           </w:tcPr>
           <w:p>
             <w:pPr>
@@ -11025,7 +11035,7 @@
         </w:tc>
         <w:tc>
           <w:tcPr>
-            <w:tcW w:type="dxa" w:w="4201"/>
+            <w:tcW w:type="dxa" w:w="4219"/>
           </w:tcPr>
           <w:p>
             <w:pPr>
@@ -11041,7 +11051,7 @@
         </w:tc>
         <w:tc>
           <w:tcPr>
-            <w:tcW w:type="dxa" w:w="2001"/>
+            <w:tcW w:type="dxa" w:w="1990"/>
           </w:tcPr>
           <w:p>
             <w:pPr>
@@ -11059,7 +11069,7 @@
       <w:tr>
         <w:tc>
           <w:tcPr>
-            <w:tcW w:type="dxa" w:w="1030"/>
+            <w:tcW w:type="dxa" w:w="1028"/>
           </w:tcPr>
           <w:p>
             <w:pPr>
@@ -11075,7 +11085,7 @@
         </w:tc>
         <w:tc>
           <w:tcPr>
-            <w:tcW w:type="dxa" w:w="2128"/>
+            <w:tcW w:type="dxa" w:w="2124"/>
           </w:tcPr>
           <w:p>
             <w:pPr>
@@ -11091,7 +11101,7 @@
         </w:tc>
         <w:tc>
           <w:tcPr>
-            <w:tcW w:type="dxa" w:w="4201"/>
+            <w:tcW w:type="dxa" w:w="4219"/>
           </w:tcPr>
           <w:p>
             <w:pPr>
@@ -11107,7 +11117,7 @@
         </w:tc>
         <w:tc>
           <w:tcPr>
-            <w:tcW w:type="dxa" w:w="2001"/>
+            <w:tcW w:type="dxa" w:w="1990"/>
           </w:tcPr>
           <w:p>
             <w:pPr>
@@ -11125,7 +11135,7 @@
       <w:tr>
         <w:tc>
           <w:tcPr>
-            <w:tcW w:type="dxa" w:w="1030"/>
+            <w:tcW w:type="dxa" w:w="1028"/>
           </w:tcPr>
           <w:p>
             <w:pPr>
@@ -11141,7 +11151,7 @@
         </w:tc>
         <w:tc>
           <w:tcPr>
-            <w:tcW w:type="dxa" w:w="2128"/>
+            <w:tcW w:type="dxa" w:w="2124"/>
           </w:tcPr>
           <w:p>
             <w:pPr>
@@ -11157,7 +11167,7 @@
         </w:tc>
         <w:tc>
           <w:tcPr>
-            <w:tcW w:type="dxa" w:w="4201"/>
+            <w:tcW w:type="dxa" w:w="4219"/>
           </w:tcPr>
           <w:p>
             <w:pPr>
@@ -11173,7 +11183,7 @@
         </w:tc>
         <w:tc>
           <w:tcPr>
-            <w:tcW w:type="dxa" w:w="2001"/>
+            <w:tcW w:type="dxa" w:w="1990"/>
           </w:tcPr>
           <w:p>
             <w:pPr>
@@ -11191,7 +11201,7 @@
       <w:tr>
         <w:tc>
           <w:tcPr>
-            <w:tcW w:type="dxa" w:w="1030"/>
+            <w:tcW w:type="dxa" w:w="1028"/>
           </w:tcPr>
           <w:p>
             <w:pPr>
@@ -11207,7 +11217,7 @@
         </w:tc>
         <w:tc>
           <w:tcPr>
-            <w:tcW w:type="dxa" w:w="2128"/>
+            <w:tcW w:type="dxa" w:w="2124"/>
           </w:tcPr>
           <w:p>
             <w:pPr>
@@ -11223,7 +11233,7 @@
         </w:tc>
         <w:tc>
           <w:tcPr>
-            <w:tcW w:type="dxa" w:w="4201"/>
+            <w:tcW w:type="dxa" w:w="4219"/>
           </w:tcPr>
           <w:p>
             <w:pPr>
@@ -11239,7 +11249,7 @@
         </w:tc>
         <w:tc>
           <w:tcPr>
-            <w:tcW w:type="dxa" w:w="2001"/>
+            <w:tcW w:type="dxa" w:w="1990"/>
           </w:tcPr>
           <w:p>
             <w:pPr>
@@ -11257,7 +11267,7 @@
       <w:tr>
         <w:tc>
           <w:tcPr>
-            <w:tcW w:type="dxa" w:w="1030"/>
+            <w:tcW w:type="dxa" w:w="1028"/>
           </w:tcPr>
           <w:p>
             <w:pPr>
@@ -11273,7 +11283,7 @@
         </w:tc>
         <w:tc>
           <w:tcPr>
-            <w:tcW w:type="dxa" w:w="2128"/>
+            <w:tcW w:type="dxa" w:w="2124"/>
           </w:tcPr>
           <w:p>
             <w:pPr>
@@ -11289,7 +11299,7 @@
         </w:tc>
         <w:tc>
           <w:tcPr>
-            <w:tcW w:type="dxa" w:w="4201"/>
+            <w:tcW w:type="dxa" w:w="4219"/>
           </w:tcPr>
           <w:p>
             <w:pPr>
@@ -11305,7 +11315,7 @@
         </w:tc>
         <w:tc>
           <w:tcPr>
-            <w:tcW w:type="dxa" w:w="2001"/>
+            <w:tcW w:type="dxa" w:w="1990"/>
           </w:tcPr>
           <w:p>
             <w:pPr>
@@ -11323,7 +11333,7 @@
       <w:tr>
         <w:tc>
           <w:tcPr>
-            <w:tcW w:type="dxa" w:w="1030"/>
+            <w:tcW w:type="dxa" w:w="1028"/>
           </w:tcPr>
           <w:p>
             <w:pPr>
@@ -11339,7 +11349,7 @@
         </w:tc>
         <w:tc>
           <w:tcPr>
-            <w:tcW w:type="dxa" w:w="2128"/>
+            <w:tcW w:type="dxa" w:w="2124"/>
           </w:tcPr>
           <w:p>
             <w:pPr>
@@ -11355,7 +11365,7 @@
         </w:tc>
         <w:tc>
           <w:tcPr>
-            <w:tcW w:type="dxa" w:w="4201"/>
+            <w:tcW w:type="dxa" w:w="4219"/>
           </w:tcPr>
           <w:p>
             <w:pPr>
@@ -11371,7 +11381,7 @@
         </w:tc>
         <w:tc>
           <w:tcPr>
-            <w:tcW w:type="dxa" w:w="2001"/>
+            <w:tcW w:type="dxa" w:w="1990"/>
           </w:tcPr>
           <w:p>
             <w:pPr>
@@ -11389,7 +11399,7 @@
       <w:tr>
         <w:tc>
           <w:tcPr>
-            <w:tcW w:type="dxa" w:w="1030"/>
+            <w:tcW w:type="dxa" w:w="1028"/>
           </w:tcPr>
           <w:p>
             <w:pPr>
@@ -11405,7 +11415,7 @@
         </w:tc>
         <w:tc>
           <w:tcPr>
-            <w:tcW w:type="dxa" w:w="2128"/>
+            <w:tcW w:type="dxa" w:w="2124"/>
           </w:tcPr>
           <w:p>
             <w:pPr>
@@ -11421,7 +11431,7 @@
         </w:tc>
         <w:tc>
           <w:tcPr>
-            <w:tcW w:type="dxa" w:w="4201"/>
+            <w:tcW w:type="dxa" w:w="4219"/>
           </w:tcPr>
           <w:p>
             <w:pPr>
@@ -11437,7 +11447,7 @@
         </w:tc>
         <w:tc>
           <w:tcPr>
-            <w:tcW w:type="dxa" w:w="2001"/>
+            <w:tcW w:type="dxa" w:w="1990"/>
           </w:tcPr>
           <w:p>
             <w:pPr>
@@ -11455,7 +11465,7 @@
       <w:tr>
         <w:tc>
           <w:tcPr>
-            <w:tcW w:type="dxa" w:w="1030"/>
+            <w:tcW w:type="dxa" w:w="1028"/>
           </w:tcPr>
           <w:p>
             <w:pPr>
@@ -11471,7 +11481,7 @@
         </w:tc>
         <w:tc>
           <w:tcPr>
-            <w:tcW w:type="dxa" w:w="2128"/>
+            <w:tcW w:type="dxa" w:w="2124"/>
           </w:tcPr>
           <w:p>
             <w:pPr>
@@ -11487,7 +11497,7 @@
         </w:tc>
         <w:tc>
           <w:tcPr>
-            <w:tcW w:type="dxa" w:w="4201"/>
+            <w:tcW w:type="dxa" w:w="4219"/>
           </w:tcPr>
           <w:p>
             <w:pPr>
@@ -11503,7 +11513,7 @@
         </w:tc>
         <w:tc>
           <w:tcPr>
-            <w:tcW w:type="dxa" w:w="2001"/>
+            <w:tcW w:type="dxa" w:w="1990"/>
           </w:tcPr>
           <w:p>
             <w:pPr>
@@ -11514,6 +11524,138 @@
                 <w:sz w:val="18"/>
               </w:rPr>
               <w:t>FR-31, FR-32</w:t>
+            </w:r>
+          </w:p>
+        </w:tc>
+      </w:tr>
+      <w:tr>
+        <w:tc>
+          <w:tcPr>
+            <w:tcW w:type="dxa" w:w="1028"/>
+          </w:tcPr>
+          <w:p>
+            <w:pPr>
+              <w:spacing w:after="0"/>
+            </w:pPr>
+            <w:r>
+              <w:rPr>
+                <w:sz w:val="18"/>
+              </w:rPr>
+              <w:t>27</w:t>
+            </w:r>
+          </w:p>
+        </w:tc>
+        <w:tc>
+          <w:tcPr>
+            <w:tcW w:type="dxa" w:w="2124"/>
+          </w:tcPr>
+          <w:p>
+            <w:pPr>
+              <w:spacing w:after="0"/>
+            </w:pPr>
+            <w:r>
+              <w:rPr>
+                <w:sz w:val="18"/>
+              </w:rPr>
+              <w:t>Resident</w:t>
+            </w:r>
+          </w:p>
+        </w:tc>
+        <w:tc>
+          <w:tcPr>
+            <w:tcW w:type="dxa" w:w="4219"/>
+          </w:tcPr>
+          <w:p>
+            <w:pPr>
+              <w:spacing w:after="0"/>
+            </w:pPr>
+            <w:r>
+              <w:rPr>
+                <w:sz w:val="18"/>
+              </w:rPr>
+              <w:t>"Me too" on an open issue from the community map</w:t>
+            </w:r>
+          </w:p>
+        </w:tc>
+        <w:tc>
+          <w:tcPr>
+            <w:tcW w:type="dxa" w:w="1990"/>
+          </w:tcPr>
+          <w:p>
+            <w:pPr>
+              <w:spacing w:after="0"/>
+            </w:pPr>
+            <w:r>
+              <w:rPr>
+                <w:sz w:val="18"/>
+              </w:rPr>
+              <w:t>FR-33, BR-23</w:t>
+            </w:r>
+          </w:p>
+        </w:tc>
+      </w:tr>
+      <w:tr>
+        <w:tc>
+          <w:tcPr>
+            <w:tcW w:type="dxa" w:w="1028"/>
+          </w:tcPr>
+          <w:p>
+            <w:pPr>
+              <w:spacing w:after="0"/>
+            </w:pPr>
+            <w:r>
+              <w:rPr>
+                <w:sz w:val="18"/>
+              </w:rPr>
+              <w:t>28</w:t>
+            </w:r>
+          </w:p>
+        </w:tc>
+        <w:tc>
+          <w:tcPr>
+            <w:tcW w:type="dxa" w:w="2124"/>
+          </w:tcPr>
+          <w:p>
+            <w:pPr>
+              <w:spacing w:after="0"/>
+            </w:pPr>
+            <w:r>
+              <w:rPr>
+                <w:sz w:val="18"/>
+              </w:rPr>
+              <w:t>Resident</w:t>
+            </w:r>
+          </w:p>
+        </w:tc>
+        <w:tc>
+          <w:tcPr>
+            <w:tcW w:type="dxa" w:w="4219"/>
+          </w:tcPr>
+          <w:p>
+            <w:pPr>
+              <w:spacing w:after="0"/>
+            </w:pPr>
+            <w:r>
+              <w:rPr>
+                <w:sz w:val="18"/>
+              </w:rPr>
+              <w:t>Offline mode: saved information with an offline notice</w:t>
+            </w:r>
+          </w:p>
+        </w:tc>
+        <w:tc>
+          <w:tcPr>
+            <w:tcW w:type="dxa" w:w="1990"/>
+          </w:tcPr>
+          <w:p>
+            <w:pPr>
+              <w:spacing w:after="0"/>
+            </w:pPr>
+            <w:r>
+              <w:rPr>
+                <w:sz w:val="18"/>
+              </w:rPr>
+              <w:t>FR-34</w:t>
             </w:r>
           </w:p>
         </w:tc>
@@ -12363,13 +12505,14 @@
         <w:tblLook w:firstColumn="1" w:firstRow="1" w:lastColumn="0" w:lastRow="0" w:noHBand="0" w:noVBand="1" w:val="04A0"/>
       </w:tblPr>
       <w:tblGrid>
-        <w:gridCol w:w="4680"/>
-        <w:gridCol w:w="4680"/>
+        <w:gridCol w:w="3120"/>
+        <w:gridCol w:w="3120"/>
+        <w:gridCol w:w="3120"/>
       </w:tblGrid>
       <w:tr>
         <w:tc>
           <w:tcPr>
-            <w:tcW w:type="dxa" w:w="4680"/>
+            <w:tcW w:type="dxa" w:w="3120"/>
           </w:tcPr>
           <w:p>
             <w:pPr>
@@ -12413,7 +12556,7 @@
         </w:tc>
         <w:tc>
           <w:tcPr>
-            <w:tcW w:type="dxa" w:w="4680"/>
+            <w:tcW w:type="dxa" w:w="3120"/>
           </w:tcPr>
           <w:p>
             <w:pPr>
@@ -12455,11 +12598,55 @@
             </w:r>
           </w:p>
         </w:tc>
+        <w:tc>
+          <w:tcPr>
+            <w:tcW w:type="dxa" w:w="3120"/>
+          </w:tcPr>
+          <w:p>
+            <w:pPr>
+              <w:jc w:val="center"/>
+            </w:pPr>
+            <w:r>
+              <w:drawing>
+                <wp:inline xmlns:a="http://schemas.openxmlformats.org/drawingml/2006/main" xmlns:pic="http://schemas.openxmlformats.org/drawingml/2006/picture">
+                  <wp:extent cx="1920240" cy="4162009"/>
+                  <wp:docPr id="29" name="Picture 29"/>
+                  <wp:cNvGraphicFramePr>
+                    <a:graphicFrameLocks noChangeAspect="1"/>
+                  </wp:cNvGraphicFramePr>
+                  <a:graphic>
+                    <a:graphicData uri="http://schemas.openxmlformats.org/drawingml/2006/picture">
+                      <pic:pic>
+                        <pic:nvPicPr>
+                          <pic:cNvPr id="0" name="18-map-me-too.png"/>
+                          <pic:cNvPicPr/>
+                        </pic:nvPicPr>
+                        <pic:blipFill>
+                          <a:blip r:embed="rId39"/>
+                          <a:stretch>
+                            <a:fillRect/>
+                          </a:stretch>
+                        </pic:blipFill>
+                        <pic:spPr>
+                          <a:xfrm>
+                            <a:off x="0" y="0"/>
+                            <a:ext cx="1920240" cy="4162009"/>
+                          </a:xfrm>
+                          <a:prstGeom prst="rect"/>
+                        </pic:spPr>
+                      </pic:pic>
+                    </a:graphicData>
+                  </a:graphic>
+                </wp:inline>
+              </w:drawing>
+            </w:r>
+          </w:p>
+        </w:tc>
       </w:tr>
       <w:tr>
         <w:tc>
           <w:tcPr>
-            <w:tcW w:type="dxa" w:w="4680"/>
+            <w:tcW w:type="dxa" w:w="3120"/>
           </w:tcPr>
           <w:p>
             <w:pPr>
@@ -12473,7 +12660,7 @@
         </w:tc>
         <w:tc>
           <w:tcPr>
-            <w:tcW w:type="dxa" w:w="4680"/>
+            <w:tcW w:type="dxa" w:w="3120"/>
           </w:tcPr>
           <w:p>
             <w:pPr>
@@ -12482,6 +12669,93 @@
             </w:pPr>
             <w:r>
               <w:t>Figure 26: Resident profile with POPIA account deletion</w:t>
+            </w:r>
+          </w:p>
+        </w:tc>
+        <w:tc>
+          <w:tcPr>
+            <w:tcW w:type="dxa" w:w="3120"/>
+          </w:tcPr>
+          <w:p>
+            <w:pPr>
+              <w:pStyle w:val="FigureCaption"/>
+              <w:jc w:val="center"/>
+            </w:pPr>
+            <w:r>
+              <w:t>Figure 27: Resident, "Me too" from the community map</w:t>
+            </w:r>
+          </w:p>
+        </w:tc>
+      </w:tr>
+    </w:tbl>
+    <w:p/>
+    <w:tbl>
+      <w:tblPr>
+        <w:tblW w:type="auto" w:w="0"/>
+        <w:jc w:val="center"/>
+        <w:tblLook w:firstColumn="1" w:firstRow="1" w:lastColumn="0" w:lastRow="0" w:noHBand="0" w:noVBand="1" w:val="04A0"/>
+      </w:tblPr>
+      <w:tblGrid>
+        <w:gridCol w:w="9360"/>
+      </w:tblGrid>
+      <w:tr>
+        <w:tc>
+          <w:tcPr>
+            <w:tcW w:type="dxa" w:w="9360"/>
+          </w:tcPr>
+          <w:p>
+            <w:pPr>
+              <w:jc w:val="center"/>
+            </w:pPr>
+            <w:r>
+              <w:drawing>
+                <wp:inline xmlns:a="http://schemas.openxmlformats.org/drawingml/2006/main" xmlns:pic="http://schemas.openxmlformats.org/drawingml/2006/picture">
+                  <wp:extent cx="1920240" cy="4162009"/>
+                  <wp:docPr id="30" name="Picture 30"/>
+                  <wp:cNvGraphicFramePr>
+                    <a:graphicFrameLocks noChangeAspect="1"/>
+                  </wp:cNvGraphicFramePr>
+                  <a:graphic>
+                    <a:graphicData uri="http://schemas.openxmlformats.org/drawingml/2006/picture">
+                      <pic:pic>
+                        <pic:nvPicPr>
+                          <pic:cNvPr id="0" name="19-offline-mode.png"/>
+                          <pic:cNvPicPr/>
+                        </pic:nvPicPr>
+                        <pic:blipFill>
+                          <a:blip r:embed="rId40"/>
+                          <a:stretch>
+                            <a:fillRect/>
+                          </a:stretch>
+                        </pic:blipFill>
+                        <pic:spPr>
+                          <a:xfrm>
+                            <a:off x="0" y="0"/>
+                            <a:ext cx="1920240" cy="4162009"/>
+                          </a:xfrm>
+                          <a:prstGeom prst="rect"/>
+                        </pic:spPr>
+                      </pic:pic>
+                    </a:graphicData>
+                  </a:graphic>
+                </wp:inline>
+              </w:drawing>
+            </w:r>
+          </w:p>
+        </w:tc>
+      </w:tr>
+      <w:tr>
+        <w:tc>
+          <w:tcPr>
+            <w:tcW w:type="dxa" w:w="9360"/>
+          </w:tcPr>
+          <w:p>
+            <w:pPr>
+              <w:pStyle w:val="FigureCaption"/>
+              <w:jc w:val="center"/>
+            </w:pPr>
+            <w:r>
+              <w:t>Figure 28: Resident, offline mode</w:t>
             </w:r>
           </w:p>
         </w:tc>
@@ -12521,7 +12795,7 @@
         <w:t>photos</w:t>
       </w:r>
       <w:r>
-        <w:t xml:space="preserve"> collection (decision D3), so the system needs no separate file store. Figure 27 shows the implemented document model. Collections are shown as entities; references between documents (Firestore has no foreign keys) are shown as relationships with their cardinalities.</w:t>
+        <w:t xml:space="preserve"> collection (decision D3), so the system needs no separate file store. Figure 29 shows the implemented document model. Collections are shown as entities; references between documents (Firestore has no foreign keys) are shown as relationships with their cardinalities.</w:t>
       </w:r>
     </w:p>
     <w:p>
@@ -12533,7 +12807,7 @@
         <w:drawing>
           <wp:inline xmlns:a="http://schemas.openxmlformats.org/drawingml/2006/main" xmlns:pic="http://schemas.openxmlformats.org/drawingml/2006/picture">
             <wp:extent cx="5943600" cy="4696750"/>
-            <wp:docPr id="29" name="Picture 29"/>
+            <wp:docPr id="31" name="Picture 31"/>
             <wp:cNvGraphicFramePr>
               <a:graphicFrameLocks noChangeAspect="1"/>
             </wp:cNvGraphicFramePr>
@@ -12545,7 +12819,7 @@
                     <pic:cNvPicPr/>
                   </pic:nvPicPr>
                   <pic:blipFill>
-                    <a:blip r:embed="rId39"/>
+                    <a:blip r:embed="rId41"/>
                     <a:stretch>
                       <a:fillRect/>
                     </a:stretch>
@@ -12570,7 +12844,7 @@
         <w:jc w:val="center"/>
       </w:pPr>
       <w:r>
-        <w:t>Figure 27: Firestore document model</w:t>
+        <w:t>Figure 29: Firestore document model</w:t>
       </w:r>
     </w:p>
     <w:p>
@@ -17350,7 +17624,7 @@
     </w:p>
     <w:p>
       <w:r>
-        <w:t>CivicLink has two runtime configurations built from the same code (Figure 28):</w:t>
+        <w:t>CivicLink has two runtime configurations built from the same code (Figure 30):</w:t>
       </w:r>
     </w:p>
     <w:p>
@@ -17421,7 +17695,7 @@
         <w:drawing>
           <wp:inline xmlns:a="http://schemas.openxmlformats.org/drawingml/2006/main" xmlns:pic="http://schemas.openxmlformats.org/drawingml/2006/picture">
             <wp:extent cx="5943600" cy="2591639"/>
-            <wp:docPr id="30" name="Picture 30"/>
+            <wp:docPr id="32" name="Picture 32"/>
             <wp:cNvGraphicFramePr>
               <a:graphicFrameLocks noChangeAspect="1"/>
             </wp:cNvGraphicFramePr>
@@ -17433,7 +17707,7 @@
                     <pic:cNvPicPr/>
                   </pic:nvPicPr>
                   <pic:blipFill>
-                    <a:blip r:embed="rId40"/>
+                    <a:blip r:embed="rId42"/>
                     <a:stretch>
                       <a:fillRect/>
                     </a:stretch>
@@ -17458,7 +17732,7 @@
         <w:jc w:val="center"/>
       </w:pPr>
       <w:r>
-        <w:t>Figure 28: Deployment diagram</w:t>
+        <w:t>Figure 30: Deployment diagram</w:t>
       </w:r>
     </w:p>
     <w:p>
@@ -30240,7 +30514,7 @@
         <w:rPr>
           <w:b/>
         </w:rPr>
-        <w:t>f2dcf1e7f2744567c2c1097d4903897a3e300323</w:t>
+        <w:t>adf5e53b399bf54b5fd6034c466f156b1c1c0711</w:t>
       </w:r>
       <w:r>
         <w:t>.</w:t>
@@ -30299,7 +30573,7 @@
         <w:t>Complete automated test results:</w:t>
       </w:r>
       <w:r>
-        <w:t xml:space="preserve"> the GitHub Actions run for commit f2dcf1e7f2744567c2c1097d4903897a3e300323 (tab "Actions"). It includes the Playwright HTML report and the coverage report as downloadable artefacts.</w:t>
+        <w:t xml:space="preserve"> the GitHub Actions run for commit adf5e53b399bf54b5fd6034c466f156b1c1c0711 (tab "Actions"). It includes the Playwright HTML report and the coverage report as downloadable artefacts.</w:t>
       </w:r>
     </w:p>
     <w:p>

</xml_diff>

<commit_message>
fix(map): marker class as constructor option (DEF-09); production E2E uses per-run locations
Found by running E2E-11 against the deployed build. Live: E2E-01, 02, 07, 11 pass; manifest, icons and sw.js served.

Co-Authored-By: Claude Opus 5.5 <noreply@anthropic.com>
</commit_message>
<xml_diff>
--- a/docs/report/CivicLink_Final_Project_Report.docx
+++ b/docs/report/CivicLink_Final_Project_Report.docx
@@ -28412,10 +28412,10 @@
         <w:tblLayout w:type="fixed"/>
       </w:tblPr>
       <w:tblGrid>
-        <w:gridCol w:w="1024"/>
-        <w:gridCol w:w="1636"/>
-        <w:gridCol w:w="3806"/>
-        <w:gridCol w:w="2894"/>
+        <w:gridCol w:w="1018"/>
+        <w:gridCol w:w="1643"/>
+        <w:gridCol w:w="3765"/>
+        <w:gridCol w:w="2934"/>
       </w:tblGrid>
       <w:tr>
         <w:trPr>
@@ -28423,7 +28423,7 @@
         </w:trPr>
         <w:tc>
           <w:tcPr>
-            <w:tcW w:type="dxa" w:w="1024"/>
+            <w:tcW w:type="dxa" w:w="1018"/>
             <w:shd w:val="clear" w:color="auto" w:fill="D5EBF4"/>
           </w:tcPr>
           <w:p>
@@ -28441,7 +28441,7 @@
         </w:tc>
         <w:tc>
           <w:tcPr>
-            <w:tcW w:type="dxa" w:w="1636"/>
+            <w:tcW w:type="dxa" w:w="1643"/>
             <w:shd w:val="clear" w:color="auto" w:fill="D5EBF4"/>
           </w:tcPr>
           <w:p>
@@ -28459,7 +28459,7 @@
         </w:tc>
         <w:tc>
           <w:tcPr>
-            <w:tcW w:type="dxa" w:w="3806"/>
+            <w:tcW w:type="dxa" w:w="3765"/>
             <w:shd w:val="clear" w:color="auto" w:fill="D5EBF4"/>
           </w:tcPr>
           <w:p>
@@ -28477,7 +28477,7 @@
         </w:tc>
         <w:tc>
           <w:tcPr>
-            <w:tcW w:type="dxa" w:w="2894"/>
+            <w:tcW w:type="dxa" w:w="2934"/>
             <w:shd w:val="clear" w:color="auto" w:fill="D5EBF4"/>
           </w:tcPr>
           <w:p>
@@ -28497,7 +28497,7 @@
       <w:tr>
         <w:tc>
           <w:tcPr>
-            <w:tcW w:type="dxa" w:w="1024"/>
+            <w:tcW w:type="dxa" w:w="1018"/>
           </w:tcPr>
           <w:p>
             <w:pPr>
@@ -28513,7 +28513,7 @@
         </w:tc>
         <w:tc>
           <w:tcPr>
-            <w:tcW w:type="dxa" w:w="1636"/>
+            <w:tcW w:type="dxa" w:w="1643"/>
           </w:tcPr>
           <w:p>
             <w:pPr>
@@ -28529,7 +28529,7 @@
         </w:tc>
         <w:tc>
           <w:tcPr>
-            <w:tcW w:type="dxa" w:w="3806"/>
+            <w:tcW w:type="dxa" w:w="3765"/>
           </w:tcPr>
           <w:p>
             <w:pPr>
@@ -28545,7 +28545,7 @@
         </w:tc>
         <w:tc>
           <w:tcPr>
-            <w:tcW w:type="dxa" w:w="2894"/>
+            <w:tcW w:type="dxa" w:w="2934"/>
           </w:tcPr>
           <w:p>
             <w:pPr>
@@ -28563,7 +28563,7 @@
       <w:tr>
         <w:tc>
           <w:tcPr>
-            <w:tcW w:type="dxa" w:w="1024"/>
+            <w:tcW w:type="dxa" w:w="1018"/>
           </w:tcPr>
           <w:p>
             <w:pPr>
@@ -28579,7 +28579,7 @@
         </w:tc>
         <w:tc>
           <w:tcPr>
-            <w:tcW w:type="dxa" w:w="1636"/>
+            <w:tcW w:type="dxa" w:w="1643"/>
           </w:tcPr>
           <w:p>
             <w:pPr>
@@ -28595,7 +28595,7 @@
         </w:tc>
         <w:tc>
           <w:tcPr>
-            <w:tcW w:type="dxa" w:w="3806"/>
+            <w:tcW w:type="dxa" w:w="3765"/>
           </w:tcPr>
           <w:p>
             <w:pPr>
@@ -28631,7 +28631,7 @@
         </w:tc>
         <w:tc>
           <w:tcPr>
-            <w:tcW w:type="dxa" w:w="2894"/>
+            <w:tcW w:type="dxa" w:w="2934"/>
           </w:tcPr>
           <w:p>
             <w:pPr>
@@ -28649,7 +28649,7 @@
       <w:tr>
         <w:tc>
           <w:tcPr>
-            <w:tcW w:type="dxa" w:w="1024"/>
+            <w:tcW w:type="dxa" w:w="1018"/>
           </w:tcPr>
           <w:p>
             <w:pPr>
@@ -28665,7 +28665,7 @@
         </w:tc>
         <w:tc>
           <w:tcPr>
-            <w:tcW w:type="dxa" w:w="1636"/>
+            <w:tcW w:type="dxa" w:w="1643"/>
           </w:tcPr>
           <w:p>
             <w:pPr>
@@ -28681,7 +28681,7 @@
         </w:tc>
         <w:tc>
           <w:tcPr>
-            <w:tcW w:type="dxa" w:w="3806"/>
+            <w:tcW w:type="dxa" w:w="3765"/>
           </w:tcPr>
           <w:p>
             <w:pPr>
@@ -28697,7 +28697,7 @@
         </w:tc>
         <w:tc>
           <w:tcPr>
-            <w:tcW w:type="dxa" w:w="2894"/>
+            <w:tcW w:type="dxa" w:w="2934"/>
           </w:tcPr>
           <w:p>
             <w:pPr>
@@ -28715,7 +28715,7 @@
       <w:tr>
         <w:tc>
           <w:tcPr>
-            <w:tcW w:type="dxa" w:w="1024"/>
+            <w:tcW w:type="dxa" w:w="1018"/>
           </w:tcPr>
           <w:p>
             <w:pPr>
@@ -28731,7 +28731,7 @@
         </w:tc>
         <w:tc>
           <w:tcPr>
-            <w:tcW w:type="dxa" w:w="1636"/>
+            <w:tcW w:type="dxa" w:w="1643"/>
           </w:tcPr>
           <w:p>
             <w:pPr>
@@ -28747,7 +28747,7 @@
         </w:tc>
         <w:tc>
           <w:tcPr>
-            <w:tcW w:type="dxa" w:w="3806"/>
+            <w:tcW w:type="dxa" w:w="3765"/>
           </w:tcPr>
           <w:p>
             <w:pPr>
@@ -28763,7 +28763,7 @@
         </w:tc>
         <w:tc>
           <w:tcPr>
-            <w:tcW w:type="dxa" w:w="2894"/>
+            <w:tcW w:type="dxa" w:w="2934"/>
           </w:tcPr>
           <w:p>
             <w:pPr>
@@ -28781,7 +28781,7 @@
       <w:tr>
         <w:tc>
           <w:tcPr>
-            <w:tcW w:type="dxa" w:w="1024"/>
+            <w:tcW w:type="dxa" w:w="1018"/>
           </w:tcPr>
           <w:p>
             <w:pPr>
@@ -28797,7 +28797,7 @@
         </w:tc>
         <w:tc>
           <w:tcPr>
-            <w:tcW w:type="dxa" w:w="1636"/>
+            <w:tcW w:type="dxa" w:w="1643"/>
           </w:tcPr>
           <w:p>
             <w:pPr>
@@ -28813,7 +28813,7 @@
         </w:tc>
         <w:tc>
           <w:tcPr>
-            <w:tcW w:type="dxa" w:w="3806"/>
+            <w:tcW w:type="dxa" w:w="3765"/>
           </w:tcPr>
           <w:p>
             <w:pPr>
@@ -28829,7 +28829,7 @@
         </w:tc>
         <w:tc>
           <w:tcPr>
-            <w:tcW w:type="dxa" w:w="2894"/>
+            <w:tcW w:type="dxa" w:w="2934"/>
           </w:tcPr>
           <w:p>
             <w:pPr>
@@ -28847,7 +28847,7 @@
       <w:tr>
         <w:tc>
           <w:tcPr>
-            <w:tcW w:type="dxa" w:w="1024"/>
+            <w:tcW w:type="dxa" w:w="1018"/>
           </w:tcPr>
           <w:p>
             <w:pPr>
@@ -28863,7 +28863,7 @@
         </w:tc>
         <w:tc>
           <w:tcPr>
-            <w:tcW w:type="dxa" w:w="1636"/>
+            <w:tcW w:type="dxa" w:w="1643"/>
           </w:tcPr>
           <w:p>
             <w:pPr>
@@ -28879,7 +28879,7 @@
         </w:tc>
         <w:tc>
           <w:tcPr>
-            <w:tcW w:type="dxa" w:w="3806"/>
+            <w:tcW w:type="dxa" w:w="3765"/>
           </w:tcPr>
           <w:p>
             <w:pPr>
@@ -28895,7 +28895,7 @@
         </w:tc>
         <w:tc>
           <w:tcPr>
-            <w:tcW w:type="dxa" w:w="2894"/>
+            <w:tcW w:type="dxa" w:w="2934"/>
           </w:tcPr>
           <w:p>
             <w:pPr>
@@ -28913,7 +28913,7 @@
       <w:tr>
         <w:tc>
           <w:tcPr>
-            <w:tcW w:type="dxa" w:w="1024"/>
+            <w:tcW w:type="dxa" w:w="1018"/>
           </w:tcPr>
           <w:p>
             <w:pPr>
@@ -28929,7 +28929,7 @@
         </w:tc>
         <w:tc>
           <w:tcPr>
-            <w:tcW w:type="dxa" w:w="1636"/>
+            <w:tcW w:type="dxa" w:w="1643"/>
           </w:tcPr>
           <w:p>
             <w:pPr>
@@ -28945,7 +28945,7 @@
         </w:tc>
         <w:tc>
           <w:tcPr>
-            <w:tcW w:type="dxa" w:w="3806"/>
+            <w:tcW w:type="dxa" w:w="3765"/>
           </w:tcPr>
           <w:p>
             <w:pPr>
@@ -28968,7 +28968,7 @@
         </w:tc>
         <w:tc>
           <w:tcPr>
-            <w:tcW w:type="dxa" w:w="2894"/>
+            <w:tcW w:type="dxa" w:w="2934"/>
           </w:tcPr>
           <w:p>
             <w:pPr>
@@ -28986,7 +28986,73 @@
       <w:tr>
         <w:tc>
           <w:tcPr>
-            <w:tcW w:type="dxa" w:w="1024"/>
+            <w:tcW w:type="dxa" w:w="1018"/>
+          </w:tcPr>
+          <w:p>
+            <w:pPr>
+              <w:spacing w:after="0"/>
+            </w:pPr>
+            <w:r>
+              <w:rPr>
+                <w:sz w:val="18"/>
+              </w:rPr>
+              <w:t>DEF-09</w:t>
+            </w:r>
+          </w:p>
+        </w:tc>
+        <w:tc>
+          <w:tcPr>
+            <w:tcW w:type="dxa" w:w="1643"/>
+          </w:tcPr>
+          <w:p>
+            <w:pPr>
+              <w:spacing w:after="0"/>
+            </w:pPr>
+            <w:r>
+              <w:rPr>
+                <w:sz w:val="18"/>
+              </w:rPr>
+              <w:t>E2E-11 against production</w:t>
+            </w:r>
+          </w:p>
+        </w:tc>
+        <w:tc>
+          <w:tcPr>
+            <w:tcW w:type="dxa" w:w="3765"/>
+          </w:tcPr>
+          <w:p>
+            <w:pPr>
+              <w:spacing w:after="0"/>
+            </w:pPr>
+            <w:r>
+              <w:rPr>
+                <w:sz w:val="18"/>
+              </w:rPr>
+              <w:t>Map markers lost their per-report CSS class in production builds (set through a styling option Leaflet ignores for classes)</w:t>
+            </w:r>
+          </w:p>
+        </w:tc>
+        <w:tc>
+          <w:tcPr>
+            <w:tcW w:type="dxa" w:w="2934"/>
+          </w:tcPr>
+          <w:p>
+            <w:pPr>
+              <w:spacing w:after="0"/>
+            </w:pPr>
+            <w:r>
+              <w:rPr>
+                <w:sz w:val="18"/>
+              </w:rPr>
+              <w:t>Class passed when the marker is created; production E2E runs now use per-run locations because live data persists</w:t>
+            </w:r>
+          </w:p>
+        </w:tc>
+      </w:tr>
+      <w:tr>
+        <w:tc>
+          <w:tcPr>
+            <w:tcW w:type="dxa" w:w="1018"/>
           </w:tcPr>
           <w:p>
             <w:pPr>
@@ -29002,7 +29068,7 @@
         </w:tc>
         <w:tc>
           <w:tcPr>
-            <w:tcW w:type="dxa" w:w="1636"/>
+            <w:tcW w:type="dxa" w:w="1643"/>
           </w:tcPr>
           <w:p>
             <w:pPr>
@@ -29018,7 +29084,7 @@
         </w:tc>
         <w:tc>
           <w:tcPr>
-            <w:tcW w:type="dxa" w:w="3806"/>
+            <w:tcW w:type="dxa" w:w="3765"/>
           </w:tcPr>
           <w:p>
             <w:pPr>
@@ -29047,7 +29113,7 @@
         </w:tc>
         <w:tc>
           <w:tcPr>
-            <w:tcW w:type="dxa" w:w="2894"/>
+            <w:tcW w:type="dxa" w:w="2934"/>
           </w:tcPr>
           <w:p>
             <w:pPr>
@@ -30514,7 +30580,7 @@
         <w:rPr>
           <w:b/>
         </w:rPr>
-        <w:t>adf5e53b399bf54b5fd6034c466f156b1c1c0711</w:t>
+        <w:t>7fa5805c2e3a3322c17a344734be7ada1a39e259</w:t>
       </w:r>
       <w:r>
         <w:t>.</w:t>
@@ -30573,7 +30639,7 @@
         <w:t>Complete automated test results:</w:t>
       </w:r>
       <w:r>
-        <w:t xml:space="preserve"> the GitHub Actions run for commit adf5e53b399bf54b5fd6034c466f156b1c1c0711 (tab "Actions"). It includes the Playwright HTML report and the coverage report as downloadable artefacts.</w:t>
+        <w:t xml:space="preserve"> the GitHub Actions run for commit 7fa5805c2e3a3322c17a344734be7ada1a39e259 (tab "Actions"). It includes the Playwright HTML report and the coverage report as downloadable artefacts.</w:t>
       </w:r>
     </w:p>
     <w:p>

</xml_diff>